<commit_message>
Cambio de manejo de imagenes
</commit_message>
<xml_diff>
--- a/entregables/justificacion-cabanas.docx
+++ b/entregables/justificacion-cabanas.docx
@@ -114,7 +114,7 @@
         <w:spacing w:line="245" w:lineRule="auto" w:after="60"/>
       </w:pPr>
       <w:r>
-        <w:t>Publicar cabañas activas con descripción, precio, capacidad, comodidades e imagen.</w:t>
+        <w:t>Publicar cabañas activas con descripción, precio, capacidad, comodidades e imagen mediante URL HTTPS pública.</w:t>
       </w:r>
     </w:p>
     <w:p>
@@ -360,7 +360,7 @@
         <w:t xml:space="preserve">Imágenes. </w:t>
       </w:r>
       <w:r>
-        <w:t>Express valida imágenes JPG, PNG o WebP de hasta 3 MB y las guarda en el directorio configurado. Firestore conserva la ruta pública.</w:t>
+        <w:t>Administración registra una URL HTTPS pública; Firestore guarda la URL y los navegadores cargan el archivo desde el sitio externo.</w:t>
       </w:r>
     </w:p>
     <w:p>
@@ -449,10 +449,10 @@
         <w:rPr>
           <w:b/>
         </w:rPr>
-        <w:t xml:space="preserve">Persistencia de imágenes. </w:t>
+        <w:t xml:space="preserve">Dependencia de imágenes externas. </w:t>
       </w:r>
       <w:r>
-        <w:t>Las imágenes residen en disco de la VM. UPLOADS_DIR debe apuntar a almacenamiento persistente y respaldado; de lo contrario, recrear la VM puede perder archivos.</w:t>
+        <w:t>Las imágenes se alojan en URLs HTTPS públicas. Si una dirección cambia, exige iniciar sesión o el proveedor la elimina, dejarán de verse. La aplicación no administra los archivos ni garantiza su tamaño, dimensiones o permanencia.</w:t>
       </w:r>
     </w:p>
     <w:p>
@@ -497,7 +497,7 @@
         <w:t xml:space="preserve">Mejoras. </w:t>
       </w:r>
       <w:r>
-        <w:t>Migrar imágenes a almacenamiento de objetos, establecer vencimiento y notificaciones de reservas, añadir pruebas automatizadas y monitoreo, y evaluar varias instancias si aumenta la demanda.</w:t>
+        <w:t>Integrar almacenamiento de objetos si se necesita administrar las imágenes; establecer vencimiento y notificaciones de reservas; añadir pruebas automatizadas y monitoreo; y evaluar varias instancias si aumenta la demanda.</w:t>
       </w:r>
     </w:p>
     <w:p>
@@ -521,7 +521,7 @@
         <w:spacing w:line="245" w:lineRule="auto" w:after="60"/>
       </w:pPr>
       <w:r>
-        <w:t>Cliente-servidor es una explicación clara de la solución: el navegador atiende a clientes y administradores, y el backend concentra reglas, autenticación, autorización y acceso a datos. La arquitectura cubre el recorrido principal y deja mejoras identificadas. Antes de la defensa se debe confirmar el inventario Azure y verificar que las imágenes usan almacenamiento persistente con respaldo.</w:t>
+        <w:t>Cliente-servidor es una explicación clara de la solución: el navegador atiende a clientes y administradores, y el backend concentra reglas, autenticación, autorización y acceso a datos. La arquitectura cubre el recorrido principal y deja mejoras identificadas. Antes de la defensa se debe confirmar el inventario de Azure y explicar que Firestore conserva URLs HTTPS públicas mientras los archivos permanecen alojados externamente.</w:t>
       </w:r>
     </w:p>
     <w:sectPr>

</xml_diff>